<commit_message>
Harden DOCX template replacement and drop unused Resend secret
Replace the positional index scheme in buildReplacementMap (count the
Nth <w:t> run) with named {{token}} placeholders baked into the
template and matched by substring. The old scheme silently misplaced
every field the moment the template's run count changed (e.g. from a
Word resave); the new applyTemplate checks up front that every
expected token is still present as a contiguous run and throws
instead of shipping misplaced content. Verified behavior-preserving
by rendering a synthetic report through both the old and new
pipelines and diffing the output text.

Also remove the RESEND_API_KEY secret/env wiring and the dead
sendViaResend() function — the report has been sending via Gmail
(sendViaGmail) since the last mail-provider switch, so Resend was
just an unused leftover.
</commit_message>
<xml_diff>
--- a/automations/film-daily-report/templates/film_daily_report_template.docx
+++ b/automations/film-daily-report/templates/film_daily_report_template.docx
@@ -56,7 +56,7 @@
                 <w:sz w:val="40"/>
                 <w:szCs w:val="40"/>
               </w:rPr>
-              <w:t>影視產業日報</w:t>
+              <w:t>{{report_title}}</w:t>
             </w:r>
           </w:p>
           <w:p>
@@ -67,7 +67,7 @@
                 <w:sz w:val="22"/>
                 <w:szCs w:val="22"/>
               </w:rPr>
-              <w:t>2026 / 06 / 10　（星期三）　　整理：AJ</w:t>
+              <w:t>{{date_line}}</w:t>
             </w:r>
           </w:p>
         </w:tc>
@@ -188,7 +188,7 @@
                 <w:sz w:val="22"/>
                 <w:szCs w:val="22"/>
               </w:rPr>
-              <w:t>DGA 達成四年期暫定協議，好萊塢停工風險顯著降低</w:t>
+              <w:t>{{highlight_1_title}}</w:t>
             </w:r>
           </w:p>
         </w:tc>
@@ -222,7 +222,7 @@
               <w:rPr>
                 <w:rFonts w:eastAsia="Arial"/>
               </w:rPr>
-              <w:t>美國三大工會本輪談判以「四年期」對齊收束（DGA 跟進 WGA、SAG-AFTRA 節奏），短期罷工風險大幅下降，製作排程可望回到可預測區間。公司若有對美合拍案或仰賴美方後期與人才的專案，現在是加速鎖定檔期與資源的好時機</w:t>
+              <w:t>{{highlight_1_body}}</w:t>
             </w:r>
             <w:proofErr w:type="gramStart"/>
             <w:r>
@@ -236,7 +236,7 @@
               <w:rPr>
                 <w:rFonts w:eastAsia="Arial"/>
               </w:rPr>
-              <w:t>但在條款未公開、待會員表決前，合約仍應保留交付彈性與不可抗力緩衝。</w:t>
+              <w:t>{{highlight_1_action}}</w:t>
             </w:r>
           </w:p>
         </w:tc>
@@ -312,7 +312,7 @@
                 <w:sz w:val="22"/>
                 <w:szCs w:val="22"/>
               </w:rPr>
-              <w:t>《Michael》全球票房破 9 億美元：音樂 IP 仍是院線確定性來源</w:t>
+              <w:t>{{highlight_2_title}}</w:t>
             </w:r>
           </w:p>
         </w:tc>
@@ -346,21 +346,21 @@
               <w:rPr>
                 <w:rFonts w:eastAsia="Arial"/>
               </w:rPr>
-              <w:t>超級巨星傳記片以跨世代知名度與音樂資產（原聲帶、授權、活動）形成</w:t>
+              <w:t>{{highlight_2_body}}</w:t>
             </w:r>
             <w:proofErr w:type="gramStart"/>
             <w:r>
               <w:rPr>
                 <w:rFonts w:eastAsia="Arial"/>
               </w:rPr>
-              <w:t>強變現鏈</w:t>
+              <w:t/>
             </w:r>
             <w:proofErr w:type="gramEnd"/>
             <w:r>
               <w:rPr>
                 <w:rFonts w:eastAsia="Arial"/>
               </w:rPr>
-              <w:t>，在全球票房不確定的環境下依然強勢。開發音樂題材時，需把版權範疇（歌曲、肖像、舞台影像）與宣發渠道（短影音、串流音樂平台）當作主戰場設計，而非僅以劇本與卡司思維推進。</w:t>
+              <w:t/>
             </w:r>
           </w:p>
         </w:tc>
@@ -436,7 +436,7 @@
                 <w:sz w:val="22"/>
                 <w:szCs w:val="22"/>
               </w:rPr>
-              <w:t>AI 工具導入引發美術指導工會強烈反彈：已升級為聲譽治理議題</w:t>
+              <w:t>{{highlight_3_title}}</w:t>
             </w:r>
           </w:p>
         </w:tc>
@@ -470,35 +470,35 @@
               <w:rPr>
                 <w:rFonts w:eastAsia="Arial"/>
               </w:rPr>
-              <w:t>知名導演與 AI 新創合作遭工會公開批評，顯示 AI 不再只是技術採購決策，而是牽動工會關係、</w:t>
+              <w:t>{{highlight_3_body}}</w:t>
             </w:r>
             <w:proofErr w:type="gramStart"/>
             <w:r>
               <w:rPr>
                 <w:rFonts w:eastAsia="Arial"/>
               </w:rPr>
-              <w:t>創作者社群</w:t>
+              <w:t/>
             </w:r>
             <w:proofErr w:type="gramEnd"/>
             <w:r>
               <w:rPr>
                 <w:rFonts w:eastAsia="Arial"/>
               </w:rPr>
-              <w:t>觀感與用工規範。若公司計畫導入生成式 AI（概念設計、分鏡、視覺開發等），需預先建立「人類創作責任邊界、訓練資料來源、署名與工時紀錄」的內</w:t>
+              <w:t/>
             </w:r>
             <w:proofErr w:type="gramStart"/>
             <w:r>
               <w:rPr>
                 <w:rFonts w:eastAsia="Arial"/>
               </w:rPr>
-              <w:t>規</w:t>
+              <w:t> </w:t>
             </w:r>
             <w:proofErr w:type="gramEnd"/>
             <w:r>
               <w:rPr>
                 <w:rFonts w:eastAsia="Arial"/>
               </w:rPr>
-              <w:t>與對外說法，否則在招募、合作和公關端容易出現不可控摩擦。</w:t>
+              <w:t>{{highlight_3_action}}</w:t>
             </w:r>
           </w:p>
         </w:tc>
@@ -635,7 +635,7 @@
                 <w:sz w:val="18"/>
                 <w:szCs w:val="18"/>
               </w:rPr>
-              <w:t>美國</w:t>
+              <w:t>{{taiwan_1_country}}</w:t>
             </w:r>
             <w:proofErr w:type="gramStart"/>
             <w:r>
@@ -659,7 +659,7 @@
                 <w:sz w:val="18"/>
                 <w:szCs w:val="18"/>
               </w:rPr>
-              <w:t>勞資談判</w:t>
+              <w:t>{{taiwan_1_label}}</w:t>
             </w:r>
             <w:r>
               <w:rPr>
@@ -670,7 +670,7 @@
                 <w:sz w:val="21"/>
                 <w:szCs w:val="21"/>
               </w:rPr>
-              <w:t xml:space="preserve">　DGA 與片廠、串流達成四年期暫定協議</w:t>
+              <w:t xml:space="preserve">{{taiwan_1_title}}</w:t>
             </w:r>
           </w:p>
         </w:tc>
@@ -717,7 +717,7 @@
                 <w:sz w:val="18"/>
                 <w:szCs w:val="18"/>
               </w:rPr>
-              <w:t>Variety Film</w:t>
+              <w:t>{{taiwan_1_source}}</w:t>
             </w:r>
             <w:r>
               <w:rPr>
@@ -745,7 +745,7 @@
                 <w:sz w:val="18"/>
                 <w:szCs w:val="18"/>
               </w:rPr>
-              <w:t>2026/06/10</w:t>
+              <w:t>{{taiwan_1_date}}</w:t>
             </w:r>
           </w:p>
         </w:tc>
@@ -794,7 +794,7 @@
                 <w:sz w:val="19"/>
                 <w:szCs w:val="19"/>
               </w:rPr>
-              <w:t>美國導演工會（DGA）與主要片廠達成四年期暫定協議，條款尚未公開，仍待工會董事會與會員表決通過。</w:t>
+              <w:t>{{taiwan_1_summary}}</w:t>
             </w:r>
           </w:p>
           <w:p>
@@ -818,7 +818,7 @@
                 <w:sz w:val="19"/>
                 <w:szCs w:val="19"/>
               </w:rPr>
-              <w:t>本輪主要工會談判進入收尾，製作環境最大變數（停工）大幅降低，有助大型製作排程、檔期與人力資源回穩。</w:t>
+              <w:t>{{taiwan_1_why}}</w:t>
             </w:r>
           </w:p>
           <w:p>
@@ -842,7 +842,7 @@
                 <w:sz w:val="19"/>
                 <w:szCs w:val="19"/>
               </w:rPr>
-              <w:t>若公司有國際合製、外包後期或美方創作者合作案，可趁風險下降窗口重啟或加速談判；在條款明確前，合約應保留交付彈性與不可抗力／延展條款。</w:t>
+              <w:t>{{taiwan_1_action}}</w:t>
             </w:r>
           </w:p>
         </w:tc>
@@ -907,7 +907,7 @@
                 <w:sz w:val="18"/>
                 <w:szCs w:val="18"/>
               </w:rPr>
-              <w:t>美國</w:t>
+              <w:t>{{taiwan_2_country}}</w:t>
             </w:r>
             <w:proofErr w:type="gramStart"/>
             <w:r>
@@ -931,7 +931,7 @@
                 <w:sz w:val="18"/>
                 <w:szCs w:val="18"/>
               </w:rPr>
-              <w:t>勞資談判</w:t>
+              <w:t>{{taiwan_2_label}}</w:t>
             </w:r>
             <w:r>
               <w:rPr>
@@ -942,7 +942,7 @@
                 <w:sz w:val="21"/>
                 <w:szCs w:val="21"/>
               </w:rPr>
-              <w:t xml:space="preserve">　Nolan 主導談判，DGA 確定四年期協議方向</w:t>
+              <w:t xml:space="preserve">{{taiwan_2_title}}</w:t>
             </w:r>
           </w:p>
         </w:tc>
@@ -989,7 +989,7 @@
                 <w:sz w:val="18"/>
                 <w:szCs w:val="18"/>
               </w:rPr>
-              <w:t>Deadline</w:t>
+              <w:t>{{taiwan_2_source}}</w:t>
             </w:r>
             <w:r>
               <w:rPr>
@@ -1017,7 +1017,7 @@
                 <w:sz w:val="18"/>
                 <w:szCs w:val="18"/>
               </w:rPr>
-              <w:t>2026/06/10</w:t>
+              <w:t>{{taiwan_2_date}}</w:t>
             </w:r>
           </w:p>
         </w:tc>
@@ -1066,7 +1066,7 @@
                 <w:sz w:val="19"/>
                 <w:szCs w:val="19"/>
               </w:rPr>
-              <w:t>DGA 最終與片廠及串流平台談成四年期暫定協議，方向與 WGA、SAG-AFTRA 一致；談判傾向不</w:t>
+              <w:t>{{taiwan_2_summary}}</w:t>
             </w:r>
             <w:proofErr w:type="gramStart"/>
             <w:r>
@@ -1108,7 +1108,7 @@
                 <w:sz w:val="19"/>
                 <w:szCs w:val="19"/>
               </w:rPr>
-              <w:t>協議年期的「對齊」代表產業端偏好中期可預測性，也可能影響未來幾年的成本結構與製作節奏。</w:t>
+              <w:t>{{taiwan_2_why}}</w:t>
             </w:r>
           </w:p>
           <w:p>
@@ -1133,7 +1133,7 @@
                 <w:sz w:val="19"/>
                 <w:szCs w:val="19"/>
               </w:rPr>
-              <w:t>評估自製或合製專案是否需調整「開拍—後期—交付」時程假設；如有海外人才簽約，留意合約期與續約節點對齊行業週期。</w:t>
+              <w:t>{{taiwan_2_action}}</w:t>
             </w:r>
           </w:p>
         </w:tc>
@@ -1198,7 +1198,7 @@
                 <w:sz w:val="18"/>
                 <w:szCs w:val="18"/>
               </w:rPr>
-              <w:t>美國</w:t>
+              <w:t>{{taiwan_3_country}}</w:t>
             </w:r>
             <w:proofErr w:type="gramStart"/>
             <w:r>
@@ -1222,7 +1222,7 @@
                 <w:sz w:val="18"/>
                 <w:szCs w:val="18"/>
               </w:rPr>
-              <w:t>票房訊號</w:t>
+              <w:t>{{taiwan_3_label}}</w:t>
             </w:r>
             <w:r>
               <w:rPr>
@@ -1233,7 +1233,7 @@
                 <w:sz w:val="21"/>
                 <w:szCs w:val="21"/>
               </w:rPr>
-              <w:t xml:space="preserve">　《Michael》全球票房突破 9 億美元</w:t>
+              <w:t xml:space="preserve">{{taiwan_3_title}}</w:t>
             </w:r>
           </w:p>
         </w:tc>
@@ -1280,7 +1280,7 @@
                 <w:sz w:val="18"/>
                 <w:szCs w:val="18"/>
               </w:rPr>
-              <w:t>Deadline</w:t>
+              <w:t>{{taiwan_3_source}}</w:t>
             </w:r>
             <w:r>
               <w:rPr>
@@ -1308,7 +1308,7 @@
                 <w:sz w:val="18"/>
                 <w:szCs w:val="18"/>
               </w:rPr>
-              <w:t>2026/06/09</w:t>
+              <w:t>{{taiwan_3_date}}</w:t>
             </w:r>
           </w:p>
         </w:tc>
@@ -1357,7 +1357,7 @@
                 <w:sz w:val="19"/>
                 <w:szCs w:val="19"/>
               </w:rPr>
-              <w:t>Lionsgate 的 Michael Jackson 傳記片《Michael》全球票房突破 9 億美元，已逼近製片 Graham King 此前作品《波希米亞狂想曲》的成績。</w:t>
+              <w:t>{{taiwan_3_summary}}</w:t>
             </w:r>
           </w:p>
           <w:p>
@@ -1381,7 +1381,7 @@
                 <w:sz w:val="19"/>
                 <w:szCs w:val="19"/>
               </w:rPr>
-              <w:t>音樂傳記片在全球市場以「高辨識度 IP＋音樂資產」雙重驅動，能有效放大國際票房與長尾收益（原聲帶、授權、二輪與 OTT）。</w:t>
+              <w:t>{{taiwan_3_why}}</w:t>
             </w:r>
           </w:p>
           <w:p>
@@ -1405,7 +1405,7 @@
                 <w:sz w:val="19"/>
                 <w:szCs w:val="19"/>
               </w:rPr>
-              <w:t>若開發音樂題材，優先盤點可取得的版權範疇（歌曲／母帶／肖像／舞台影像），並把宣發規劃前置到開發期（短影音、音樂平台合作、跨品牌活動）。</w:t>
+              <w:t>{{taiwan_3_action}}</w:t>
             </w:r>
           </w:p>
         </w:tc>
@@ -1470,7 +1470,7 @@
                 <w:sz w:val="18"/>
                 <w:szCs w:val="18"/>
               </w:rPr>
-              <w:t>美國</w:t>
+              <w:t>{{intl_1_country}}</w:t>
             </w:r>
             <w:proofErr w:type="gramStart"/>
             <w:r>
@@ -1494,7 +1494,7 @@
                 <w:sz w:val="18"/>
                 <w:szCs w:val="18"/>
               </w:rPr>
-              <w:t>行銷操作</w:t>
+              <w:t>{{intl_1_label}}</w:t>
             </w:r>
             <w:r>
               <w:rPr>
@@ -1505,7 +1505,7 @@
                 <w:sz w:val="21"/>
                 <w:szCs w:val="21"/>
               </w:rPr>
-              <w:t xml:space="preserve">　Taylor Swift 出席《Toy Story 5》首映，搭配原創歌曲先行宣傳</w:t>
+              <w:t xml:space="preserve">{{intl_1_title}}</w:t>
             </w:r>
           </w:p>
         </w:tc>
@@ -1552,7 +1552,7 @@
                 <w:sz w:val="18"/>
                 <w:szCs w:val="18"/>
               </w:rPr>
-              <w:t>Hollywood Reporter / Variety Film</w:t>
+              <w:t>{{intl_1_source}}</w:t>
             </w:r>
             <w:r>
               <w:rPr>
@@ -1580,7 +1580,7 @@
                 <w:sz w:val="18"/>
                 <w:szCs w:val="18"/>
               </w:rPr>
-              <w:t>2026/06/10</w:t>
+              <w:t>{{intl_1_date}}</w:t>
             </w:r>
           </w:p>
         </w:tc>
@@ -1629,7 +1629,7 @@
                 <w:sz w:val="19"/>
                 <w:szCs w:val="19"/>
               </w:rPr>
-              <w:t>Taylor Swift 出席《Toy Story 5》洛杉磯首映，為電影創作原創歌曲「I Knew It, I Knew You」，其</w:t>
+              <w:t>{{intl_1_summary}}</w:t>
             </w:r>
             <w:proofErr w:type="gramStart"/>
             <w:r>
@@ -1638,7 +1638,7 @@
                 <w:sz w:val="19"/>
                 <w:szCs w:val="19"/>
               </w:rPr>
-              <w:t>新歌已先行</w:t>
+              <w:t/>
             </w:r>
             <w:proofErr w:type="gramEnd"/>
             <w:r>
@@ -1647,7 +1647,7 @@
                 <w:sz w:val="19"/>
                 <w:szCs w:val="19"/>
               </w:rPr>
-              <w:t>釋出並帶動關注。</w:t>
+              <w:t/>
             </w:r>
           </w:p>
           <w:p>
@@ -1671,7 +1671,7 @@
                 <w:sz w:val="19"/>
                 <w:szCs w:val="19"/>
               </w:rPr>
-              <w:t>以「全球級音樂人＋原創曲」綁定動畫 IP，能在上映前建立跨圈層聲量（音樂榜單、社群二創、粉絲動員），拉高家庭向作品的觸及效率。首映活動也從紅</w:t>
+              <w:t>{{intl_1_why}}</w:t>
             </w:r>
             <w:proofErr w:type="gramStart"/>
             <w:r>
@@ -1680,7 +1680,7 @@
                 <w:sz w:val="19"/>
                 <w:szCs w:val="19"/>
               </w:rPr>
-              <w:t>毯</w:t>
+              <w:t/>
             </w:r>
             <w:proofErr w:type="gramEnd"/>
             <w:r>
@@ -1689,7 +1689,7 @@
                 <w:sz w:val="19"/>
                 <w:szCs w:val="19"/>
               </w:rPr>
-              <w:t>曝光擴展為「音樂內容先行」的節點策略。</w:t>
+              <w:t/>
             </w:r>
           </w:p>
           <w:p>
@@ -1713,7 +1713,7 @@
                 <w:sz w:val="19"/>
                 <w:szCs w:val="19"/>
               </w:rPr>
-              <w:t>規劃「歌手原創曲」作為行銷主軸時，應同步設計 MV、短影音挑戰、平台首發策略與授權分潤架構；首映活動則應提前規劃</w:t>
+              <w:t>{{intl_1_action}}</w:t>
             </w:r>
             <w:proofErr w:type="gramStart"/>
             <w:r>
@@ -1722,7 +1722,7 @@
                 <w:sz w:val="19"/>
                 <w:szCs w:val="19"/>
               </w:rPr>
-              <w:t>可拆條的</w:t>
+              <w:t/>
             </w:r>
             <w:proofErr w:type="gramEnd"/>
             <w:r>
@@ -1731,7 +1731,7 @@
                 <w:sz w:val="19"/>
                 <w:szCs w:val="19"/>
               </w:rPr>
-              <w:t>素材（卡司合照、幕後花絮、歌曲片段），形成多波段擴散。</w:t>
+              <w:t/>
             </w:r>
           </w:p>
         </w:tc>
@@ -1796,7 +1796,7 @@
                 <w:sz w:val="18"/>
                 <w:szCs w:val="18"/>
               </w:rPr>
-              <w:t>美國</w:t>
+              <w:t>{{intl_2_country}}</w:t>
             </w:r>
             <w:proofErr w:type="gramStart"/>
             <w:r>
@@ -1820,7 +1820,7 @@
                 <w:sz w:val="18"/>
                 <w:szCs w:val="18"/>
               </w:rPr>
-              <w:t>技術與工會</w:t>
+              <w:t>{{intl_2_label}}</w:t>
             </w:r>
             <w:r>
               <w:rPr>
@@ -1831,7 +1831,7 @@
                 <w:sz w:val="21"/>
                 <w:szCs w:val="21"/>
               </w:rPr>
-              <w:t xml:space="preserve">　美術指導工會抨擊知名導演與 AI 新創合作</w:t>
+              <w:t xml:space="preserve">{{intl_2_title}}</w:t>
             </w:r>
           </w:p>
         </w:tc>
@@ -1878,7 +1878,7 @@
                 <w:sz w:val="18"/>
                 <w:szCs w:val="18"/>
               </w:rPr>
-              <w:t>Variety Film / Hollywood Reporter</w:t>
+              <w:t>{{intl_2_source}}</w:t>
             </w:r>
             <w:r>
               <w:rPr>
@@ -1906,7 +1906,7 @@
                 <w:sz w:val="18"/>
                 <w:szCs w:val="18"/>
               </w:rPr>
-              <w:t>2026/06/10</w:t>
+              <w:t>{{intl_2_date}}</w:t>
             </w:r>
           </w:p>
         </w:tc>
@@ -1955,7 +1955,7 @@
                 <w:sz w:val="19"/>
                 <w:szCs w:val="19"/>
               </w:rPr>
-              <w:t>美術指導工會針對知名導演與 AI 新創合作發表聲明，指控其「背離人類藝術家」，反映工會對 AI 介入美術、分鏡等領域的高度敏感。工會同時批評導演公開推廣 AI 工具對人類創作者的衝擊。</w:t>
+              <w:t>{{intl_2_summary}}</w:t>
             </w:r>
           </w:p>
           <w:p>
@@ -1979,7 +1979,7 @@
                 <w:sz w:val="19"/>
                 <w:szCs w:val="19"/>
               </w:rPr>
-              <w:t>AI 導入的爭議已從「效率工具」升級為「勞動權益與創作倫理」議題，未來可能影響製作流程、合約條款與公關風險。</w:t>
+              <w:t>{{intl_2_why}}</w:t>
             </w:r>
             <w:proofErr w:type="gramStart"/>
             <w:r>
@@ -1988,7 +1988,7 @@
                 <w:sz w:val="19"/>
                 <w:szCs w:val="19"/>
               </w:rPr>
-              <w:t>若工</w:t>
+              <w:t/>
             </w:r>
             <w:proofErr w:type="gramEnd"/>
             <w:r>
@@ -1997,7 +1997,7 @@
                 <w:sz w:val="19"/>
                 <w:szCs w:val="19"/>
               </w:rPr>
-              <w:t>會態度持續強硬，美術、分鏡、概念設計等環節可能出現新的談判條款或抵制壓力。</w:t>
+              <w:t/>
             </w:r>
           </w:p>
           <w:p>
@@ -2021,7 +2021,7 @@
                 <w:sz w:val="19"/>
                 <w:szCs w:val="19"/>
               </w:rPr>
-              <w:t>建立 AI 使用準則（用途範疇、資料來源合規、人工審核責任、署名與工時紀錄），並在對外合作簡報中預先揭露治理框架以降低疑慮。涉及國際合作或海外輸出的專案，AI 流程必須可稽核（audit-ready），以免在合作方合</w:t>
+              <w:t>{{intl_2_action}}</w:t>
             </w:r>
             <w:proofErr w:type="gramStart"/>
             <w:r>
@@ -2030,7 +2030,7 @@
                 <w:sz w:val="19"/>
                 <w:szCs w:val="19"/>
               </w:rPr>
-              <w:t>規</w:t>
+              <w:t/>
             </w:r>
             <w:proofErr w:type="gramEnd"/>
             <w:r>
@@ -2039,7 +2039,7 @@
                 <w:sz w:val="19"/>
                 <w:szCs w:val="19"/>
               </w:rPr>
-              <w:t>審查或人才聘用</w:t>
+              <w:t/>
             </w:r>
             <w:proofErr w:type="gramStart"/>
             <w:r>
@@ -2048,7 +2048,7 @@
                 <w:sz w:val="19"/>
                 <w:szCs w:val="19"/>
               </w:rPr>
-              <w:t>上卡關</w:t>
+              <w:t/>
             </w:r>
             <w:proofErr w:type="gramEnd"/>
             <w:r>
@@ -2057,7 +2057,7 @@
                 <w:sz w:val="19"/>
                 <w:szCs w:val="19"/>
               </w:rPr>
-              <w:t>。</w:t>
+              <w:t/>
             </w:r>
           </w:p>
         </w:tc>
@@ -2122,7 +2122,7 @@
                 <w:sz w:val="18"/>
                 <w:szCs w:val="18"/>
               </w:rPr>
-              <w:t>美國</w:t>
+              <w:t>{{intl_3_country}}</w:t>
             </w:r>
             <w:proofErr w:type="gramStart"/>
             <w:r>
@@ -2146,7 +2146,7 @@
                 <w:sz w:val="18"/>
                 <w:szCs w:val="18"/>
               </w:rPr>
-              <w:t>版權與發行</w:t>
+              <w:t>{{intl_3_label}}</w:t>
             </w:r>
             <w:r>
               <w:rPr>
@@ -2157,7 +2157,7 @@
                 <w:sz w:val="21"/>
                 <w:szCs w:val="21"/>
               </w:rPr>
-              <w:t xml:space="preserve">　Persimmon 收購懸</w:t>
+              <w:t xml:space="preserve">{{intl_3_title}}</w:t>
             </w:r>
             <w:proofErr w:type="gramStart"/>
             <w:r>
@@ -2169,7 +2169,7 @@
                 <w:sz w:val="21"/>
                 <w:szCs w:val="21"/>
               </w:rPr>
-              <w:t>疑</w:t>
+              <w:t/>
             </w:r>
             <w:proofErr w:type="gramEnd"/>
             <w:r>
@@ -2181,7 +2181,7 @@
                 <w:sz w:val="21"/>
                 <w:szCs w:val="21"/>
               </w:rPr>
-              <w:t>片《Death on the Brandywine》多地發行權</w:t>
+              <w:t/>
             </w:r>
           </w:p>
         </w:tc>
@@ -2228,7 +2228,7 @@
                 <w:sz w:val="18"/>
                 <w:szCs w:val="18"/>
               </w:rPr>
-              <w:t>Variety Film</w:t>
+              <w:t>{{intl_3_source}}</w:t>
             </w:r>
             <w:r>
               <w:rPr>
@@ -2256,7 +2256,7 @@
                 <w:sz w:val="18"/>
                 <w:szCs w:val="18"/>
               </w:rPr>
-              <w:t>2026/06/09</w:t>
+              <w:t>{{intl_3_date}}</w:t>
             </w:r>
           </w:p>
         </w:tc>
@@ -2305,7 +2305,7 @@
                 <w:sz w:val="19"/>
                 <w:szCs w:val="19"/>
               </w:rPr>
-              <w:t>獨立發行公司 Persimmon 取得懸</w:t>
+              <w:t>{{intl_3_summary}}</w:t>
             </w:r>
             <w:proofErr w:type="gramStart"/>
             <w:r>
@@ -2314,7 +2314,7 @@
                 <w:sz w:val="19"/>
                 <w:szCs w:val="19"/>
               </w:rPr>
-              <w:t>疑</w:t>
+              <w:t/>
             </w:r>
             <w:proofErr w:type="gramEnd"/>
             <w:r>
@@ -2323,7 +2323,7 @@
                 <w:sz w:val="19"/>
                 <w:szCs w:val="19"/>
               </w:rPr>
-              <w:t>片《Death on the Brandywine》美國及部分國際地區發行權，主演包含 Kate Burton 等。</w:t>
+              <w:t/>
             </w:r>
           </w:p>
           <w:p>
@@ -2347,7 +2347,7 @@
                 <w:sz w:val="19"/>
                 <w:szCs w:val="19"/>
               </w:rPr>
-              <w:t>中型類型片（懸疑／推理）透過「分區發行權」交易持續活躍，顯示傳統國際銷售與領地拆分仍具市場空間。</w:t>
+              <w:t>{{intl_3_why}}</w:t>
             </w:r>
           </w:p>
           <w:p>
@@ -2371,7 +2371,7 @@
                 <w:sz w:val="19"/>
                 <w:szCs w:val="19"/>
               </w:rPr>
-              <w:t>若公司有中成本類型片，可在開發期即規劃可拆分的國際銷售包裝（類型定位、卡司可售性、海報與預告素材），提高預售與區域買家談判籌碼。</w:t>
+              <w:t>{{intl_3_action}}</w:t>
             </w:r>
           </w:p>
         </w:tc>
@@ -2465,7 +2465,7 @@
                 <w:sz w:val="18"/>
                 <w:szCs w:val="18"/>
               </w:rPr>
-              <w:t>美國</w:t>
+              <w:t>{{series_1_country}}</w:t>
             </w:r>
             <w:proofErr w:type="gramStart"/>
             <w:r>
@@ -2489,7 +2489,7 @@
                 <w:sz w:val="18"/>
                 <w:szCs w:val="18"/>
               </w:rPr>
-              <w:t>非虛構內容</w:t>
+              <w:t>{{series_1_label}}</w:t>
             </w:r>
             <w:r>
               <w:rPr>
@@ -2500,7 +2500,7 @@
                 <w:sz w:val="21"/>
                 <w:szCs w:val="21"/>
               </w:rPr>
-              <w:t xml:space="preserve">　Sony Pictures Television 任命 Devon Hammonds 為非虛構內容主管</w:t>
+              <w:t xml:space="preserve">{{series_1_title}}</w:t>
             </w:r>
           </w:p>
         </w:tc>
@@ -2547,7 +2547,7 @@
                 <w:sz w:val="18"/>
                 <w:szCs w:val="18"/>
               </w:rPr>
-              <w:t>Hollywood Reporter</w:t>
+              <w:t>{{series_1_source}}</w:t>
             </w:r>
             <w:r>
               <w:rPr>
@@ -2575,7 +2575,7 @@
                 <w:sz w:val="18"/>
                 <w:szCs w:val="18"/>
               </w:rPr>
-              <w:t>2026/06/09</w:t>
+              <w:t>{{series_1_date}}</w:t>
             </w:r>
           </w:p>
         </w:tc>
@@ -2625,7 +2625,7 @@
                 <w:sz w:val="19"/>
                 <w:szCs w:val="19"/>
               </w:rPr>
-              <w:t>Sony Pictures Television 提拔 Devon Hammonds 掌管非虛構內容，涵蓋競賽、實境到紀錄片等廣泛專案線。</w:t>
+              <w:t>{{series_1_summary}}</w:t>
             </w:r>
           </w:p>
           <w:p>
@@ -2649,7 +2649,7 @@
                 <w:sz w:val="19"/>
                 <w:szCs w:val="19"/>
               </w:rPr>
-              <w:t>大型製作公司持續加碼「非虛構」作為可規模化的內容資產（多季、衍生、授權格式），並以組織調整強化產能。</w:t>
+              <w:t>{{series_1_why}}</w:t>
             </w:r>
           </w:p>
           <w:p>
@@ -2673,7 +2673,7 @@
                 <w:sz w:val="19"/>
                 <w:szCs w:val="19"/>
               </w:rPr>
-              <w:t>評估自家非虛構開發線（實境／紀錄／競賽）是否需要更清晰的「可複製格式」與回收模型（品牌置入、國際版權、二次剪輯）。</w:t>
+              <w:t>{{series_1_action}}</w:t>
             </w:r>
           </w:p>
         </w:tc>
@@ -2738,7 +2738,7 @@
                 <w:sz w:val="18"/>
                 <w:szCs w:val="18"/>
               </w:rPr>
-              <w:t>美國</w:t>
+              <w:t>{{series_2_country}}</w:t>
             </w:r>
             <w:proofErr w:type="gramStart"/>
             <w:r>
@@ -2762,7 +2762,7 @@
                 <w:sz w:val="18"/>
                 <w:szCs w:val="18"/>
               </w:rPr>
-              <w:t>檔期與上架策略</w:t>
+              <w:t>{{series_2_label}}</w:t>
             </w:r>
             <w:r>
               <w:rPr>
@@ -2773,7 +2773,7 @@
                 <w:sz w:val="21"/>
                 <w:szCs w:val="21"/>
               </w:rPr>
-              <w:t xml:space="preserve">　FX《Adults》第二</w:t>
+              <w:t xml:space="preserve">{{series_2_title}}</w:t>
             </w:r>
             <w:proofErr w:type="gramStart"/>
             <w:r>
@@ -2785,7 +2785,7 @@
                 <w:sz w:val="21"/>
                 <w:szCs w:val="21"/>
               </w:rPr>
-              <w:t>季定檔</w:t>
+              <w:t/>
             </w:r>
             <w:proofErr w:type="gramEnd"/>
             <w:r>
@@ -2797,7 +2797,7 @@
                 <w:sz w:val="21"/>
                 <w:szCs w:val="21"/>
               </w:rPr>
-              <w:t>：FXX 播出、Hulu 同日全季上架</w:t>
+              <w:t/>
             </w:r>
           </w:p>
         </w:tc>
@@ -2844,7 +2844,7 @@
                 <w:sz w:val="18"/>
                 <w:szCs w:val="18"/>
               </w:rPr>
-              <w:t>Deadline</w:t>
+              <w:t>{{series_2_source}}</w:t>
             </w:r>
             <w:r>
               <w:rPr>
@@ -2872,7 +2872,7 @@
                 <w:sz w:val="18"/>
                 <w:szCs w:val="18"/>
               </w:rPr>
-              <w:t>2026/06/09</w:t>
+              <w:t>{{series_2_date}}</w:t>
             </w:r>
           </w:p>
         </w:tc>
@@ -2921,7 +2921,7 @@
                 <w:sz w:val="19"/>
                 <w:szCs w:val="19"/>
               </w:rPr>
-              <w:t>《Adults》S2 將於 8/27 在 FXX 與 Hulu 上線，</w:t>
+              <w:t>{{series_2_summary}}</w:t>
             </w:r>
             <w:proofErr w:type="gramStart"/>
             <w:r>
@@ -2930,7 +2930,7 @@
                 <w:sz w:val="19"/>
                 <w:szCs w:val="19"/>
               </w:rPr>
-              <w:t>採</w:t>
+              <w:t/>
             </w:r>
             <w:proofErr w:type="gramEnd"/>
             <w:r>
@@ -2939,7 +2939,7 @@
                 <w:sz w:val="19"/>
                 <w:szCs w:val="19"/>
               </w:rPr>
-              <w:t>首日全 8 集一次上架策略，同時公布多位客串卡司。</w:t>
+              <w:t/>
             </w:r>
           </w:p>
           <w:p>
@@ -2963,7 +2963,7 @@
                 <w:sz w:val="19"/>
                 <w:szCs w:val="19"/>
               </w:rPr>
-              <w:t>線性頻道＋串流「同日全季上架」顯示平台對喜劇內容採取更偏向 binge 的留存策略，並用客串卡司製造社群話題點。</w:t>
+              <w:t>{{series_2_why}}</w:t>
             </w:r>
           </w:p>
           <w:p>
@@ -2987,7 +2987,7 @@
                 <w:sz w:val="19"/>
                 <w:szCs w:val="19"/>
               </w:rPr>
-              <w:t>若規劃喜劇或都會群像，可把「客串／友情出演」當作宣發資產提前談定，並依平台偏好決定週更或全上架，避免後期被動改節奏。</w:t>
+              <w:t>{{series_2_action}}</w:t>
             </w:r>
           </w:p>
         </w:tc>
@@ -3052,7 +3052,7 @@
                 <w:sz w:val="18"/>
                 <w:szCs w:val="18"/>
               </w:rPr>
-              <w:t>韓國</w:t>
+              <w:t>{{series_3_country}}</w:t>
             </w:r>
             <w:proofErr w:type="gramStart"/>
             <w:r>
@@ -3076,7 +3076,7 @@
                 <w:sz w:val="18"/>
                 <w:szCs w:val="18"/>
               </w:rPr>
-              <w:t>平台製作</w:t>
+              <w:t>{{series_3_label}}</w:t>
             </w:r>
             <w:r>
               <w:rPr>
@@ -3087,7 +3087,7 @@
                 <w:sz w:val="21"/>
                 <w:szCs w:val="21"/>
               </w:rPr>
-              <w:t xml:space="preserve">　Netflix 宣布製作犯罪喜劇驚悚劇《Paper Man》（暫名）並公開主演陣容</w:t>
+              <w:t xml:space="preserve">{{series_3_title}}</w:t>
             </w:r>
           </w:p>
         </w:tc>
@@ -3135,7 +3135,7 @@
                 <w:sz w:val="18"/>
                 <w:szCs w:val="18"/>
               </w:rPr>
-              <w:t>Soompi</w:t>
+              <w:t>{{series_3_source}}</w:t>
             </w:r>
             <w:proofErr w:type="spellEnd"/>
             <w:r>
@@ -3164,7 +3164,7 @@
                 <w:sz w:val="18"/>
                 <w:szCs w:val="18"/>
               </w:rPr>
-              <w:t>2026/06/09</w:t>
+              <w:t>{{series_3_date}}</w:t>
             </w:r>
           </w:p>
         </w:tc>
@@ -3213,7 +3213,7 @@
                 <w:sz w:val="19"/>
                 <w:szCs w:val="19"/>
               </w:rPr>
-              <w:t>Netflix 公布新劇《Paper Man》（暫名）進入製作，確認主演陣容</w:t>
+              <w:t>{{series_3_summary}}</w:t>
             </w:r>
             <w:proofErr w:type="gramStart"/>
             <w:r>
@@ -3222,7 +3222,7 @@
                 <w:sz w:val="19"/>
                 <w:szCs w:val="19"/>
               </w:rPr>
-              <w:t>含曹政奭、朴海秀</w:t>
+              <w:t/>
             </w:r>
             <w:proofErr w:type="gramEnd"/>
             <w:r>
@@ -3231,7 +3231,7 @@
                 <w:sz w:val="19"/>
                 <w:szCs w:val="19"/>
               </w:rPr>
-              <w:t>、Claudia Kim，題材為喜劇調性的犯罪驚悚。</w:t>
+              <w:t/>
             </w:r>
           </w:p>
           <w:p>
@@ -3255,7 +3255,7 @@
                 <w:sz w:val="19"/>
                 <w:szCs w:val="19"/>
               </w:rPr>
-              <w:t>Netflix 持續以「強卡司＋混合類型（喜劇×犯罪×驚悚）」拉高全球可看性，韓國內容仍以類型混搭搶國際市場。</w:t>
+              <w:t>{{series_3_why}}</w:t>
             </w:r>
           </w:p>
           <w:p>
@@ -3279,7 +3279,7 @@
                 <w:sz w:val="19"/>
                 <w:szCs w:val="19"/>
               </w:rPr>
-              <w:t>開發面向國際 OTT 的華語內容時，可思考「單一類型」是否足以支撐全球包裝——以清晰的主類型為骨架，再用次類型提高可看性與宣傳切點。</w:t>
+              <w:t>{{series_3_action}}</w:t>
             </w:r>
           </w:p>
         </w:tc>
@@ -3373,7 +3373,7 @@
                 <w:sz w:val="18"/>
                 <w:szCs w:val="18"/>
               </w:rPr>
-              <w:t>韓國</w:t>
+              <w:t>{{ott_film_country}}</w:t>
             </w:r>
             <w:proofErr w:type="gramStart"/>
             <w:r>
@@ -3397,7 +3397,7 @@
                 <w:sz w:val="18"/>
                 <w:szCs w:val="18"/>
               </w:rPr>
-              <w:t>Netflix</w:t>
+              <w:t>{{ott_film_label}}</w:t>
             </w:r>
             <w:r>
               <w:rPr>
@@ -3408,7 +3408,7 @@
                 <w:sz w:val="21"/>
                 <w:szCs w:val="21"/>
               </w:rPr>
-              <w:t xml:space="preserve">　</w:t>
+              <w:t xml:space="preserve"/>
             </w:r>
             <w:proofErr w:type="spellStart"/>
             <w:r>
@@ -3420,7 +3420,7 @@
                 <w:sz w:val="21"/>
                 <w:szCs w:val="21"/>
               </w:rPr>
-              <w:t>Netflix</w:t>
+              <w:t>{{ott_film_title}}</w:t>
             </w:r>
             <w:proofErr w:type="spellEnd"/>
             <w:r>
@@ -3432,7 +3432,7 @@
                 <w:sz w:val="21"/>
                 <w:szCs w:val="21"/>
               </w:rPr>
-              <w:t xml:space="preserve"> 電影《Husbands in Action》釋出劇照：「前夫×現任丈夫」強迫組隊動作喜劇</w:t>
+              <w:t xml:space="preserve"/>
             </w:r>
           </w:p>
         </w:tc>
@@ -3480,7 +3480,7 @@
                 <w:sz w:val="18"/>
                 <w:szCs w:val="18"/>
               </w:rPr>
-              <w:t>Soompi</w:t>
+              <w:t>{{ott_film_source}}</w:t>
             </w:r>
             <w:proofErr w:type="spellEnd"/>
             <w:r>
@@ -3509,7 +3509,7 @@
                 <w:sz w:val="18"/>
                 <w:szCs w:val="18"/>
               </w:rPr>
-              <w:t>2026/06/08</w:t>
+              <w:t>{{ott_film_date}}</w:t>
             </w:r>
           </w:p>
         </w:tc>
@@ -3558,7 +3558,7 @@
                 <w:sz w:val="19"/>
                 <w:szCs w:val="19"/>
               </w:rPr>
-              <w:t>Netflix 韓國電影《Husbands in Action》公開角色劇照，設定為：前夫與現任丈夫被迫合作，營救遭綁架的妻子。</w:t>
+              <w:t>{{ott_film_summary}}</w:t>
             </w:r>
           </w:p>
           <w:p>
@@ -3582,7 +3582,7 @@
                 <w:sz w:val="19"/>
                 <w:szCs w:val="19"/>
               </w:rPr>
-              <w:t>OTT 電影偏好「高概念、一句話說清楚」的類型片，動作喜劇能跨語言輸出並適合短影音剪輯。</w:t>
+              <w:t>{{ott_film_why}}</w:t>
             </w:r>
           </w:p>
           <w:p>
@@ -3606,7 +3606,7 @@
                 <w:sz w:val="19"/>
                 <w:szCs w:val="19"/>
               </w:rPr>
-              <w:t>若布局 OTT 電影，應優先開發可國際理解的高概念類型（動作／犯罪／驚悚／喜劇混搭），並在劇本階段就設計可剪預告與短影音的段落。</w:t>
+              <w:t>{{ott_film_action}}</w:t>
             </w:r>
           </w:p>
         </w:tc>
@@ -3700,7 +3700,7 @@
                 <w:sz w:val="18"/>
                 <w:szCs w:val="18"/>
               </w:rPr>
-              <w:t>美國</w:t>
+              <w:t>{{ott_series_1_country}}</w:t>
             </w:r>
             <w:proofErr w:type="gramStart"/>
             <w:r>
@@ -3724,7 +3724,7 @@
                 <w:sz w:val="18"/>
                 <w:szCs w:val="18"/>
               </w:rPr>
-              <w:t>Peacock</w:t>
+              <w:t>{{ott_series_1_label}}</w:t>
             </w:r>
             <w:r>
               <w:rPr>
@@ -3735,7 +3735,7 @@
                 <w:sz w:val="21"/>
                 <w:szCs w:val="21"/>
               </w:rPr>
-              <w:t xml:space="preserve">　《Summer House》S10 Reunion 創系列史上最高收視</w:t>
+              <w:t xml:space="preserve">{{ott_series_1_title}}</w:t>
             </w:r>
           </w:p>
         </w:tc>
@@ -3782,7 +3782,7 @@
                 <w:sz w:val="18"/>
                 <w:szCs w:val="18"/>
               </w:rPr>
-              <w:t>Variety Film</w:t>
+              <w:t>{{ott_series_1_source}}</w:t>
             </w:r>
             <w:r>
               <w:rPr>
@@ -3810,7 +3810,7 @@
                 <w:sz w:val="18"/>
                 <w:szCs w:val="18"/>
               </w:rPr>
-              <w:t>2026/06/09</w:t>
+              <w:t>{{ott_series_1_date}}</w:t>
             </w:r>
           </w:p>
         </w:tc>
@@ -3859,7 +3859,7 @@
                 <w:sz w:val="19"/>
                 <w:szCs w:val="19"/>
               </w:rPr>
-              <w:t>NBCUniversal 指出《Summer House》S10 Reunion Part 1（</w:t>
+              <w:t>{{ott_series_1_summary}}</w:t>
             </w:r>
             <w:proofErr w:type="spellStart"/>
             <w:r>
@@ -3868,7 +3868,7 @@
                 <w:sz w:val="19"/>
                 <w:szCs w:val="19"/>
               </w:rPr>
-              <w:t>Live+Same</w:t>
+              <w:t/>
             </w:r>
             <w:proofErr w:type="spellEnd"/>
             <w:r>
@@ -3877,7 +3877,7 @@
                 <w:sz w:val="19"/>
                 <w:szCs w:val="19"/>
               </w:rPr>
-              <w:t xml:space="preserve"> Day）創該節目史上最高；跨平台七日觀看亦表現強勁。</w:t>
+              <w:t xml:space="preserve"/>
             </w:r>
           </w:p>
           <w:p>
@@ -3901,7 +3901,7 @@
                 <w:sz w:val="19"/>
                 <w:szCs w:val="19"/>
               </w:rPr>
-              <w:t>實境內容的「reunion／結算篇」能顯著拉升收視與討論，事件化敘事與集中式節點發布仍是 OTT 留存與拉新的利器。</w:t>
+              <w:t>{{ott_series_1_why}}</w:t>
             </w:r>
           </w:p>
           <w:p>
@@ -3925,7 +3925,7 @@
                 <w:sz w:val="19"/>
                 <w:szCs w:val="19"/>
               </w:rPr>
-              <w:t>若自製實境或綜藝，可把「回顧／結算特輯」納入標配產品設計，並規劃獨立宣傳檔期與招商（冠名、置入、直播互動）。</w:t>
+              <w:t>{{ott_series_1_action}}</w:t>
             </w:r>
           </w:p>
         </w:tc>
@@ -3990,7 +3990,7 @@
                 <w:sz w:val="18"/>
                 <w:szCs w:val="18"/>
               </w:rPr>
-              <w:t>美國</w:t>
+              <w:t>{{ott_series_2_country}}</w:t>
             </w:r>
             <w:proofErr w:type="gramStart"/>
             <w:r>
@@ -4014,7 +4014,7 @@
                 <w:sz w:val="18"/>
                 <w:szCs w:val="18"/>
               </w:rPr>
-              <w:t>Bravo / Peacock</w:t>
+              <w:t>{{ott_series_2_label}}</w:t>
             </w:r>
             <w:r>
               <w:rPr>
@@ -4037,7 +4037,7 @@
                 <w:sz w:val="21"/>
                 <w:szCs w:val="21"/>
               </w:rPr>
-              <w:t>《</w:t>
+              <w:t>{{ott_series_2_title}}</w:t>
             </w:r>
             <w:proofErr w:type="gramEnd"/>
             <w:r>
@@ -4049,7 +4049,7 @@
                 <w:sz w:val="21"/>
                 <w:szCs w:val="21"/>
               </w:rPr>
-              <w:t>Summer House: The Aftermath</w:t>
+              <w:t/>
             </w:r>
             <w:proofErr w:type="gramStart"/>
             <w:r>
@@ -4061,7 +4061,7 @@
                 <w:sz w:val="21"/>
                 <w:szCs w:val="21"/>
               </w:rPr>
-              <w:t>》</w:t>
+              <w:t/>
             </w:r>
             <w:proofErr w:type="gramEnd"/>
             <w:r>
@@ -4073,7 +4073,7 @@
                 <w:sz w:val="21"/>
                 <w:szCs w:val="21"/>
               </w:rPr>
-              <w:t>加碼</w:t>
+              <w:t/>
             </w:r>
             <w:proofErr w:type="gramStart"/>
             <w:r>
@@ -4085,7 +4085,7 @@
                 <w:sz w:val="21"/>
                 <w:szCs w:val="21"/>
               </w:rPr>
-              <w:t>特別篇</w:t>
+              <w:t/>
             </w:r>
             <w:proofErr w:type="gramEnd"/>
             <w:r>
@@ -4097,7 +4097,7 @@
                 <w:sz w:val="21"/>
                 <w:szCs w:val="21"/>
               </w:rPr>
-              <w:t>：延長 Reunion 後話題熱度</w:t>
+              <w:t/>
             </w:r>
           </w:p>
         </w:tc>
@@ -4144,7 +4144,7 @@
                 <w:sz w:val="18"/>
                 <w:szCs w:val="18"/>
               </w:rPr>
-              <w:t>Hollywood Reporter</w:t>
+              <w:t>{{ott_series_2_source}}</w:t>
             </w:r>
             <w:r>
               <w:rPr>
@@ -4172,7 +4172,7 @@
                 <w:sz w:val="18"/>
                 <w:szCs w:val="18"/>
               </w:rPr>
-              <w:t>2026/06/10</w:t>
+              <w:t>{{ott_series_2_date}}</w:t>
             </w:r>
           </w:p>
         </w:tc>
@@ -4221,7 +4221,7 @@
                 <w:sz w:val="19"/>
                 <w:szCs w:val="19"/>
               </w:rPr>
-              <w:t xml:space="preserve">Bravo 在三集 Reunion </w:t>
+              <w:t xml:space="preserve">{{ott_series_2_summary}}</w:t>
             </w:r>
             <w:proofErr w:type="gramStart"/>
             <w:r>
@@ -4230,7 +4230,7 @@
                 <w:sz w:val="19"/>
                 <w:szCs w:val="19"/>
               </w:rPr>
-              <w:t>後加拍推出《</w:t>
+              <w:t/>
             </w:r>
             <w:proofErr w:type="gramEnd"/>
             <w:r>
@@ -4239,7 +4239,7 @@
                 <w:sz w:val="19"/>
                 <w:szCs w:val="19"/>
               </w:rPr>
-              <w:t>Summer House: The Aftermath</w:t>
+              <w:t/>
             </w:r>
             <w:proofErr w:type="gramStart"/>
             <w:r>
@@ -4248,7 +4248,7 @@
                 <w:sz w:val="19"/>
                 <w:szCs w:val="19"/>
               </w:rPr>
-              <w:t>》特別篇</w:t>
+              <w:t/>
             </w:r>
             <w:proofErr w:type="gramEnd"/>
             <w:r>
@@ -4257,7 +4257,7 @@
                 <w:sz w:val="19"/>
                 <w:szCs w:val="19"/>
               </w:rPr>
-              <w:t>，主打「Reunion 後續影響」與現場即時反應。</w:t>
+              <w:t/>
             </w:r>
           </w:p>
           <w:p>
@@ -4281,7 +4281,7 @@
                 <w:sz w:val="19"/>
                 <w:szCs w:val="19"/>
               </w:rPr>
-              <w:t>這是將實境節目當作「可即時追加產能」的內容產品：以最小成本延長話題週期，提升平台停留與社群討論。</w:t>
+              <w:t>{{ott_series_2_why}}</w:t>
             </w:r>
           </w:p>
           <w:p>
@@ -4305,7 +4305,7 @@
                 <w:sz w:val="19"/>
                 <w:szCs w:val="19"/>
               </w:rPr>
-              <w:t>建立「機動拍攝／快速剪輯」能力與合約條款（追加拍攝天數、素材使用權），讓節目在爆點出現時能快速推出加更或特輯搶流量。</w:t>
+              <w:t>{{ott_series_2_action}}</w:t>
             </w:r>
           </w:p>
         </w:tc>
@@ -4370,7 +4370,7 @@
                 <w:sz w:val="18"/>
                 <w:szCs w:val="18"/>
               </w:rPr>
-              <w:t>韓國</w:t>
+              <w:t>{{ott_series_3_country}}</w:t>
             </w:r>
             <w:proofErr w:type="gramStart"/>
             <w:r>
@@ -4394,7 +4394,7 @@
                 <w:sz w:val="18"/>
                 <w:szCs w:val="18"/>
               </w:rPr>
-              <w:t>Netflix</w:t>
+              <w:t>{{ott_series_3_label}}</w:t>
             </w:r>
             <w:r>
               <w:rPr>
@@ -4405,7 +4405,7 @@
                 <w:sz w:val="21"/>
                 <w:szCs w:val="21"/>
               </w:rPr>
-              <w:t xml:space="preserve">　《Better Late Than Single 2》公布首播日，釋出新預告</w:t>
+              <w:t xml:space="preserve">{{ott_series_3_title}}</w:t>
             </w:r>
           </w:p>
         </w:tc>
@@ -4453,7 +4453,7 @@
                 <w:sz w:val="18"/>
                 <w:szCs w:val="18"/>
               </w:rPr>
-              <w:t>Soompi</w:t>
+              <w:t>{{ott_series_3_source}}</w:t>
             </w:r>
             <w:proofErr w:type="spellEnd"/>
             <w:r>
@@ -4482,7 +4482,7 @@
                 <w:sz w:val="18"/>
                 <w:szCs w:val="18"/>
               </w:rPr>
-              <w:t>2026/06/09</w:t>
+              <w:t>{{ott_series_3_date}}</w:t>
             </w:r>
           </w:p>
         </w:tc>
@@ -4531,7 +4531,7 @@
                 <w:sz w:val="19"/>
                 <w:szCs w:val="19"/>
               </w:rPr>
-              <w:t>Netflix 公布戀愛實境《Better Late Than Single 2》首播資訊並釋出預告，節目設定為「改造式」戀愛實境。</w:t>
+              <w:t>{{ott_series_3_summary}}</w:t>
             </w:r>
           </w:p>
           <w:p>
@@ -4555,7 +4555,7 @@
                 <w:sz w:val="19"/>
                 <w:szCs w:val="19"/>
               </w:rPr>
-              <w:t>戀愛實境進入「子類型內卷」：從純約會轉向改造或成長敘事，以提高角色弧線與可剪輯片段密度，利於社群擴散。</w:t>
+              <w:t>{{ott_series_3_why}}</w:t>
             </w:r>
           </w:p>
           <w:p>
@@ -4579,7 +4579,7 @@
                 <w:sz w:val="19"/>
                 <w:szCs w:val="19"/>
               </w:rPr>
-              <w:t>若投入戀愛或實境開發，需在機制上做出可辨識差異（職涯／改造／任務制／社群互動），並提前規劃短影音切條模板與 KOL 反應影片合作。</w:t>
+              <w:t>{{ott_series_3_action}}</w:t>
             </w:r>
           </w:p>
         </w:tc>
@@ -4685,7 +4685,7 @@
                 <w:bCs/>
                 <w:color w:val="B45309"/>
               </w:rPr>
-              <w:t>⚠ 今日候選新聞未包含足夠的上映或上線資訊</w:t>
+              <w:t>{{release_headline}}</w:t>
             </w:r>
           </w:p>
           <w:p>
@@ -4696,7 +4696,7 @@
                 <w:sz w:val="19"/>
                 <w:szCs w:val="19"/>
               </w:rPr>
-              <w:t>建議另行對照本</w:t>
+              <w:t/>
             </w:r>
             <w:proofErr w:type="gramStart"/>
             <w:r>
@@ -4706,7 +4706,7 @@
                 <w:sz w:val="19"/>
                 <w:szCs w:val="19"/>
               </w:rPr>
-              <w:t>週排片表與</w:t>
+              <w:t/>
             </w:r>
             <w:proofErr w:type="gramEnd"/>
             <w:r>
@@ -4716,7 +4716,7 @@
                 <w:sz w:val="19"/>
                 <w:szCs w:val="19"/>
               </w:rPr>
-              <w:t>各平台行事曆補齊。</w:t>
+              <w:t>{{release_body}}</w:t>
             </w:r>
           </w:p>
         </w:tc>
@@ -4827,14 +4827,14 @@
                 <w:sz w:val="24"/>
                 <w:szCs w:val="24"/>
               </w:rPr>
-              <w:t>《驀然回首》</w:t>
+              <w:t>{{featured_title}}</w:t>
             </w:r>
             <w:r>
               <w:rPr>
                 <w:rFonts w:eastAsia="Arial"/>
                 <w:color w:val="555555"/>
               </w:rPr>
-              <w:t xml:space="preserve">　真人電影　日本</w:t>
+              <w:t xml:space="preserve">{{featured_meta}}</w:t>
             </w:r>
           </w:p>
           <w:p>
@@ -4858,7 +4858,7 @@
                 <w:sz w:val="19"/>
                 <w:szCs w:val="19"/>
               </w:rPr>
-              <w:t>台灣上映日已確認（9/11），並釋出前導海報及選角資訊。屬「強作者（是枝裕和）×知名漫畫 IP（藤本樹原作）」的高市場期待型專案，具備影迷與漫畫粉雙重基本盤。</w:t>
+              <w:t>{{featured_reason}}</w:t>
             </w:r>
           </w:p>
           <w:p>
@@ -4882,7 +4882,7 @@
                 <w:sz w:val="19"/>
                 <w:szCs w:val="19"/>
               </w:rPr>
-              <w:t>正式預告釋出節奏、台灣發行宣傳資源投入力道、是否搭配影展／</w:t>
+              <w:t/>
             </w:r>
             <w:proofErr w:type="gramStart"/>
             <w:r>
@@ -4891,7 +4891,7 @@
                 <w:sz w:val="19"/>
                 <w:szCs w:val="19"/>
               </w:rPr>
-              <w:t>特</w:t>
+              <w:t/>
             </w:r>
             <w:proofErr w:type="gramEnd"/>
             <w:r>
@@ -4900,7 +4900,7 @@
                 <w:sz w:val="19"/>
                 <w:szCs w:val="19"/>
               </w:rPr>
-              <w:t>映口碑操作，以及漫畫圈與電影圈的</w:t>
+              <w:t>{{featured_watch}}</w:t>
             </w:r>
             <w:proofErr w:type="gramStart"/>
             <w:r>
@@ -4909,7 +4909,7 @@
                 <w:sz w:val="19"/>
                 <w:szCs w:val="19"/>
               </w:rPr>
-              <w:t>跨圈層</w:t>
+              <w:t> </w:t>
             </w:r>
             <w:proofErr w:type="gramEnd"/>
             <w:r>
@@ -4918,7 +4918,7 @@
                 <w:sz w:val="19"/>
                 <w:szCs w:val="19"/>
               </w:rPr>
-              <w:t>合作策略。</w:t>
+              <w:t> </w:t>
             </w:r>
           </w:p>
         </w:tc>
@@ -5012,7 +5012,7 @@
           <w:bCs/>
           <w:color w:val="1A3A5C"/>
         </w:rPr>
-        <w:t>◆ 音樂與名人資產的「跨平台變現」</w:t>
+        <w:t>{{theme_1_headline}}</w:t>
       </w:r>
     </w:p>
     <w:p>
@@ -5026,7 +5026,7 @@
           <w:sz w:val="19"/>
           <w:szCs w:val="19"/>
         </w:rPr>
-        <w:t>以《Michael》為代表，票房之外同步帶動音樂、授權與活動的整體收益鏈，顯示強 IP 的長尾潛力遠超票房本身。</w:t>
+        <w:t>{{theme_1_body}}</w:t>
       </w:r>
     </w:p>
     <w:p>
@@ -5040,7 +5040,7 @@
           <w:bCs/>
           <w:color w:val="1A3A5C"/>
         </w:rPr>
-        <w:t>◆ 高概念動作喜劇持續適配 OTT 電影</w:t>
+        <w:t>{{theme_2_headline}}</w:t>
       </w:r>
     </w:p>
     <w:p>
@@ -5055,7 +5055,7 @@
           <w:szCs w:val="19"/>
         </w:rPr>
         <w:lastRenderedPageBreak/>
-        <w:t>如「前夫×現任丈夫被迫合作」這類一句話說</w:t>
+        <w:t>{{theme_2_body}}</w:t>
       </w:r>
       <w:proofErr w:type="gramStart"/>
       <w:r>
@@ -5064,7 +5064,7 @@
           <w:sz w:val="19"/>
           <w:szCs w:val="19"/>
         </w:rPr>
-        <w:t>清楚的</w:t>
+        <w:t/>
       </w:r>
       <w:proofErr w:type="gramEnd"/>
       <w:r>
@@ -5073,7 +5073,7 @@
           <w:sz w:val="19"/>
           <w:szCs w:val="19"/>
         </w:rPr>
-        <w:t>設定，有利國際理解</w:t>
+        <w:t/>
       </w:r>
       <w:proofErr w:type="gramStart"/>
       <w:r>
@@ -5082,7 +5082,7 @@
           <w:sz w:val="19"/>
           <w:szCs w:val="19"/>
         </w:rPr>
-        <w:t>與短影音</w:t>
+        <w:t/>
       </w:r>
       <w:proofErr w:type="gramEnd"/>
       <w:r>
@@ -5091,7 +5091,7 @@
           <w:sz w:val="19"/>
           <w:szCs w:val="19"/>
         </w:rPr>
-        <w:t>擴散，成為 OTT 電影的穩定類型選擇。</w:t>
+        <w:t/>
       </w:r>
     </w:p>
     <w:p>
@@ -5105,7 +5105,7 @@
           <w:bCs/>
           <w:color w:val="1A3A5C"/>
         </w:rPr>
-        <w:t>◆ 犯罪</w:t>
+        <w:t>{{theme_3_headline}}</w:t>
       </w:r>
       <w:proofErr w:type="gramStart"/>
       <w:r>
@@ -5115,7 +5115,7 @@
           <w:bCs/>
           <w:color w:val="1A3A5C"/>
         </w:rPr>
-        <w:t>╱驚悚混搭喜劇</w:t>
+        <w:t>{{theme_3_body}}</w:t>
       </w:r>
       <w:proofErr w:type="gramEnd"/>
       <w:r>
@@ -5125,7 +5125,7 @@
           <w:bCs/>
           <w:color w:val="1A3A5C"/>
         </w:rPr>
-        <w:t>的全球化包裝</w:t>
+        <w:t/>
       </w:r>
     </w:p>
     <w:p>
@@ -5139,7 +5139,7 @@
           <w:sz w:val="19"/>
           <w:szCs w:val="19"/>
         </w:rPr>
-        <w:t>Netflix 韓國新劇以混合類型與強卡司擴大可看性，降低單一類型的地域限制，成為面向國際市場的有效策略。</w:t>
+        <w:t/>
       </w:r>
     </w:p>
     <w:p>
@@ -5187,7 +5187,7 @@
           <w:bCs/>
           <w:color w:val="1A3A5C"/>
         </w:rPr>
-        <w:t>◆ 勞資風險下降，製作供給回補</w:t>
+        <w:t>{{market_1_headline}}</w:t>
       </w:r>
     </w:p>
     <w:p>
@@ -5201,7 +5201,7 @@
           <w:sz w:val="19"/>
           <w:szCs w:val="19"/>
         </w:rPr>
-        <w:t>DGA 四年期暫定協議使美國製作端可預測性提升，國際合拍案</w:t>
+        <w:t>{{market_1_body}}</w:t>
       </w:r>
       <w:proofErr w:type="gramStart"/>
       <w:r>
@@ -5210,7 +5210,7 @@
           <w:sz w:val="19"/>
           <w:szCs w:val="19"/>
         </w:rPr>
-        <w:t>更易談檔期</w:t>
+        <w:t/>
       </w:r>
       <w:proofErr w:type="gramEnd"/>
       <w:r>
@@ -5219,7 +5219,7 @@
           <w:sz w:val="19"/>
           <w:szCs w:val="19"/>
         </w:rPr>
-        <w:t>與排程，短期製作窗口重新打開。</w:t>
+        <w:t/>
       </w:r>
     </w:p>
     <w:p>
@@ -5233,7 +5233,7 @@
           <w:bCs/>
           <w:color w:val="1A3A5C"/>
         </w:rPr>
-        <w:t>◆ 實境節目以「Reunion＋加更特輯」</w:t>
+        <w:t>{{market_2_headline}}</w:t>
       </w:r>
       <w:proofErr w:type="gramStart"/>
       <w:r>
@@ -5243,7 +5243,7 @@
           <w:bCs/>
           <w:color w:val="1A3A5C"/>
         </w:rPr>
-        <w:t>拉高跨平台</w:t>
+        <w:t>{{market_2_body}}</w:t>
       </w:r>
       <w:proofErr w:type="gramEnd"/>
       <w:r>
@@ -5253,7 +5253,7 @@
           <w:bCs/>
           <w:color w:val="1A3A5C"/>
         </w:rPr>
-        <w:t>觀看</w:t>
+        <w:t/>
       </w:r>
     </w:p>
     <w:p>
@@ -5267,7 +5267,7 @@
           <w:sz w:val="19"/>
           <w:szCs w:val="19"/>
         </w:rPr>
-        <w:t>平台重視事件化節點與追加內容的留存效率，Reunion 成為獨立大檔、Aftermath 特輯再接熱度，形成完整曲線。</w:t>
+        <w:t/>
       </w:r>
     </w:p>
     <w:p>
@@ -5281,7 +5281,7 @@
           <w:bCs/>
           <w:color w:val="1A3A5C"/>
         </w:rPr>
-        <w:t>◆ AI 正式進入工會與聲譽戰場</w:t>
+        <w:t>{{market_3_headline}}</w:t>
       </w:r>
     </w:p>
     <w:p>
@@ -5295,7 +5295,7 @@
           <w:sz w:val="19"/>
           <w:szCs w:val="19"/>
         </w:rPr>
-        <w:t>AI 導入不再只關乎成本效率，也牽動人才合作與對外形象；治理框架需先於導入決策，否則風險難以預測。</w:t>
+        <w:t>{{market_3_body}}</w:t>
       </w:r>
     </w:p>
     <w:p>
@@ -5317,7 +5317,7 @@
           <w:sz w:val="22"/>
           <w:szCs w:val="22"/>
         </w:rPr>
-        <w:t>▌</w:t>
+        <w:t/>
       </w:r>
       <w:proofErr w:type="gramEnd"/>
       <w:r>
@@ -5343,7 +5343,7 @@
           <w:bCs/>
           <w:color w:val="1A3A5C"/>
         </w:rPr>
-        <w:t>◆ 「原創曲先行＋首映現身」</w:t>
+        <w:t>{{promotion_1_headline}}</w:t>
       </w:r>
       <w:proofErr w:type="gramStart"/>
       <w:r>
@@ -5353,7 +5353,7 @@
           <w:bCs/>
           <w:color w:val="1A3A5C"/>
         </w:rPr>
-        <w:t>跨圈層</w:t>
+        <w:t>{{promotion_1_body}}</w:t>
       </w:r>
       <w:proofErr w:type="gramEnd"/>
       <w:r>
@@ -5363,7 +5363,7 @@
           <w:bCs/>
           <w:color w:val="1A3A5C"/>
         </w:rPr>
-        <w:t>宣發</w:t>
+        <w:t/>
       </w:r>
     </w:p>
     <w:p>
@@ -5377,7 +5377,7 @@
           <w:sz w:val="19"/>
           <w:szCs w:val="19"/>
         </w:rPr>
-        <w:t>用音樂榜單與粉絲動員提前拉高電影曝光，首映從紅</w:t>
+        <w:t/>
       </w:r>
       <w:proofErr w:type="gramStart"/>
       <w:r>
@@ -5409,7 +5409,7 @@
           <w:bCs/>
           <w:color w:val="1A3A5C"/>
         </w:rPr>
-        <w:t>◆ 實境節目「結算篇（Reunion）」當作獨立大檔操作</w:t>
+        <w:t>{{promotion_2_headline}}</w:t>
       </w:r>
     </w:p>
     <w:p>
@@ -5423,7 +5423,7 @@
           <w:sz w:val="19"/>
           <w:szCs w:val="19"/>
         </w:rPr>
-        <w:t>集中火力</w:t>
+        <w:t>{{promotion_2_body}}</w:t>
       </w:r>
       <w:proofErr w:type="gramStart"/>
       <w:r>
@@ -5432,7 +5432,7 @@
           <w:sz w:val="19"/>
           <w:szCs w:val="19"/>
         </w:rPr>
-        <w:t>衝</w:t>
+        <w:t/>
       </w:r>
       <w:proofErr w:type="gramEnd"/>
       <w:r>
@@ -5441,7 +5441,7 @@
           <w:sz w:val="19"/>
           <w:szCs w:val="19"/>
         </w:rPr>
-        <w:t>收視，再以 Aftermath 特輯延長熱度曲線</w:t>
+        <w:t/>
       </w:r>
       <w:proofErr w:type="gramStart"/>
       <w:r>
@@ -5473,7 +5473,7 @@
           <w:bCs/>
           <w:color w:val="1A3A5C"/>
         </w:rPr>
-        <w:t>◆ 喜劇影集用客串</w:t>
+        <w:t>{{promotion_3_headline}}</w:t>
       </w:r>
       <w:proofErr w:type="gramStart"/>
       <w:r>
@@ -5483,7 +5483,7 @@
           <w:bCs/>
           <w:color w:val="1A3A5C"/>
         </w:rPr>
-        <w:t>卡司做社</w:t>
+        <w:t>{{promotion_3_body}}</w:t>
       </w:r>
       <w:proofErr w:type="gramEnd"/>
       <w:r>
@@ -5493,7 +5493,7 @@
           <w:bCs/>
           <w:color w:val="1A3A5C"/>
         </w:rPr>
-        <w:t>群話題錨點</w:t>
+        <w:t/>
       </w:r>
     </w:p>
     <w:p>
@@ -5507,7 +5507,7 @@
           <w:sz w:val="19"/>
           <w:szCs w:val="19"/>
         </w:rPr>
-        <w:t>全季一次上架時，以多位可辨識的客串演員擴散到不同</w:t>
+        <w:t/>
       </w:r>
       <w:proofErr w:type="gramStart"/>
       <w:r>
@@ -5573,55 +5573,55 @@
           <w:bCs/>
           <w:color w:val="2E75B6"/>
         </w:rPr>
-        <w:t xml:space="preserve">演員　</w:t>
-      </w:r>
-      <w:r>
-        <w:rPr>
-          <w:rFonts w:eastAsia="Arial"/>
-        </w:rPr>
-        <w:t>出口</w:t>
+        <w:t xml:space="preserve">機構　</w:t>
+      </w:r>
+      <w:r>
+        <w:rPr>
+          <w:rFonts w:eastAsia="Arial"/>
+        </w:rPr>
+        <w:t>{{observables_institutions}}</w:t>
       </w:r>
       <w:proofErr w:type="gramStart"/>
       <w:r>
         <w:rPr>
           <w:rFonts w:eastAsia="Arial"/>
         </w:rPr>
-        <w:t>夏希、蒔</w:t>
+        <w:t/>
       </w:r>
       <w:proofErr w:type="gramEnd"/>
       <w:r>
         <w:rPr>
           <w:rFonts w:eastAsia="Arial"/>
         </w:rPr>
-        <w:t>田彩珠（《驀然回首》真人版）　曹政</w:t>
+        <w:t/>
       </w:r>
       <w:proofErr w:type="gramStart"/>
       <w:r>
         <w:rPr>
           <w:rFonts w:eastAsia="Arial"/>
         </w:rPr>
-        <w:t>奭</w:t>
+        <w:t/>
       </w:r>
       <w:proofErr w:type="gramEnd"/>
       <w:r>
         <w:rPr>
           <w:rFonts w:eastAsia="Arial"/>
         </w:rPr>
-        <w:t>、</w:t>
+        <w:t/>
       </w:r>
       <w:proofErr w:type="gramStart"/>
       <w:r>
         <w:rPr>
           <w:rFonts w:eastAsia="Arial"/>
         </w:rPr>
-        <w:t>朴海秀</w:t>
+        <w:t/>
       </w:r>
       <w:proofErr w:type="gramEnd"/>
       <w:r>
         <w:rPr>
           <w:rFonts w:eastAsia="Arial"/>
         </w:rPr>
-        <w:t>、Claudia Kim（《Paper Man》暫名）</w:t>
+        <w:t/>
       </w:r>
     </w:p>
     <w:p>
@@ -5635,21 +5635,21 @@
           <w:bCs/>
           <w:color w:val="2E75B6"/>
         </w:rPr>
-        <w:t xml:space="preserve">導演　</w:t>
+        <w:t xml:space="preserve">題材　</w:t>
       </w:r>
       <w:proofErr w:type="gramStart"/>
       <w:r>
         <w:rPr>
           <w:rFonts w:eastAsia="Arial"/>
         </w:rPr>
-        <w:t>是枝裕</w:t>
+        <w:t>{{observables_genres}}</w:t>
       </w:r>
       <w:proofErr w:type="gramEnd"/>
       <w:r>
         <w:rPr>
           <w:rFonts w:eastAsia="Arial"/>
         </w:rPr>
-        <w:t>和（《驀然回首》真人版）</w:t>
+        <w:t/>
       </w:r>
     </w:p>
     <w:p>
@@ -5663,13 +5663,13 @@
           <w:bCs/>
           <w:color w:val="2E75B6"/>
         </w:rPr>
-        <w:t xml:space="preserve">製作公司　</w:t>
-      </w:r>
-      <w:r>
-        <w:rPr>
-          <w:rFonts w:eastAsia="Arial"/>
-        </w:rPr>
-        <w:t>Sony Pictures Television（非虛構內容線持續擴張）</w:t>
+        <w:t xml:space="preserve">決策指標　</w:t>
+      </w:r>
+      <w:r>
+        <w:rPr>
+          <w:rFonts w:eastAsia="Arial"/>
+        </w:rPr>
+        <w:t>{{observables_metrics}}</w:t>
       </w:r>
     </w:p>
     <w:p>
@@ -5683,13 +5683,13 @@
           <w:bCs/>
           <w:color w:val="2E75B6"/>
         </w:rPr>
-        <w:t xml:space="preserve">OTT 平台　</w:t>
-      </w:r>
-      <w:r>
-        <w:rPr>
-          <w:rFonts w:eastAsia="Arial"/>
-        </w:rPr>
-        <w:t>Netflix（韓國影集／電影與戀愛實境持續上新）　Hulu（與 FX 的同步上架策略）</w:t>
+        <w:t xml:space="preserve">優先動作　</w:t>
+      </w:r>
+      <w:r>
+        <w:rPr>
+          <w:rFonts w:eastAsia="Arial"/>
+        </w:rPr>
+        <w:t>{{observables_actions}}</w:t>
       </w:r>
     </w:p>
     <w:p>
@@ -5703,27 +5703,27 @@
           <w:bCs/>
           <w:color w:val="2E75B6"/>
         </w:rPr>
-        <w:t xml:space="preserve">IP 作品　</w:t>
-      </w:r>
-      <w:r>
-        <w:rPr>
-          <w:rFonts w:eastAsia="Arial"/>
-        </w:rPr>
-        <w:t xml:space="preserve">《Toy Story 5》　Michael Jackson 音樂資產　</w:t>
+        <w:t xml:space="preserve"/>
+      </w:r>
+      <w:r>
+        <w:rPr>
+          <w:rFonts w:eastAsia="Arial"/>
+        </w:rPr>
+        <w:t xml:space="preserve"> </w:t>
       </w:r>
       <w:proofErr w:type="gramStart"/>
       <w:r>
         <w:rPr>
           <w:rFonts w:eastAsia="Arial"/>
         </w:rPr>
-        <w:t>藤本樹原作</w:t>
+        <w:t> </w:t>
       </w:r>
       <w:proofErr w:type="gramEnd"/>
       <w:r>
         <w:rPr>
           <w:rFonts w:eastAsia="Arial"/>
         </w:rPr>
-        <w:t>《驀然回首》</w:t>
+        <w:t> </w:t>
       </w:r>
     </w:p>
     <w:p>

</xml_diff>